<commit_message>
Fix 3 issues: name placeholder, מרכז מגיד hardcode, PDF via print
1. Add {name} placeholder above phone line in contract.docx (was missing)
2. Replace {name} after 'הפעלת' with hardcoded 'מרכז מגיד' (underlined)
3. PDF button now fills DOCX → converts to HTML via mammoth → opens
   browser print dialog (Save as PDF) — avoids Hebrew font distortion
   from the old pdf-lib coordinate approach

Co-Authored-By: Claude Sonnet 4.6 <noreply@anthropic.com>
</commit_message>
<xml_diff>
--- a/contract.docx
+++ b/contract.docx
@@ -1191,6 +1191,24 @@
       </w:pPr>
       <w:r>
         <w:rPr>
+          <w:spacing w:val="80"/>
+          <w:w w:val="150"/>
+          <w:u w:val="single"/>
+          <w:rtl/>
+        </w:rPr>
+        <w:t xml:space="preserve">{name}</w:t>
+      </w:r>
+    </w:p>
+    <w:p>
+      <w:pPr>
+        <w:pStyle w:val="BodyText"/>
+        <w:bidi/>
+        <w:spacing w:before="8"/>
+        <w:ind w:right="4971" w:left="0" w:firstLine="0"/>
+        <w:jc w:val="left"/>
+      </w:pPr>
+      <w:r>
+        <w:rPr>
           <w:spacing w:val="-4"/>
           <w:w w:val="115"/>
           <w:rtl/>
@@ -1484,7 +1502,7 @@
           <w:u w:val="single"/>
           <w:rtl/>
         </w:rPr>
-        <w:t xml:space="preserve">{name}</w:t>
+        <w:t xml:space="preserve">מרכז מגיד</w:t>
       </w:r>
       <w:r>
         <w:rPr>

</xml_diff>

<commit_message>
Fix {name} paragraph formatting in contract.docx
Remove the 4971-twip right indent and bidi constraints that were
squishing the name field. Now uses clean spacing matching the
reference layout the user provided.

Co-Authored-By: Claude Sonnet 4.6 <noreply@anthropic.com>
</commit_message>
<xml_diff>
--- a/contract.docx
+++ b/contract.docx
@@ -1185,14 +1185,10 @@
       <w:pPr>
         <w:pStyle w:val="BodyText"/>
         <w:bidi/>
-        <w:spacing w:before="8"/>
-        <w:ind w:right="4971" w:left="0" w:firstLine="0"/>
-        <w:jc w:val="left"/>
+        <w:spacing w:before="21" w:after="25"/>
       </w:pPr>
       <w:r>
         <w:rPr>
-          <w:spacing w:val="80"/>
-          <w:w w:val="150"/>
           <w:u w:val="single"/>
           <w:rtl/>
         </w:rPr>

</xml_diff>

<commit_message>
Fix {name} indent to align with מרח' line
Match right=4971 indent and jc=left from the מרח' paragraph so the
name value appears directly above it with the same left alignment.

Co-Authored-By: Claude Sonnet 4.6 <noreply@anthropic.com>
</commit_message>
<xml_diff>
--- a/contract.docx
+++ b/contract.docx
@@ -1185,7 +1185,9 @@
       <w:pPr>
         <w:pStyle w:val="BodyText"/>
         <w:bidi/>
-        <w:spacing w:before="21" w:after="25"/>
+        <w:spacing w:before="8"/>
+        <w:ind w:right="4971" w:left="0" w:firstLine="0"/>
+        <w:jc w:val="left"/>
       </w:pPr>
       <w:r>
         <w:rPr>

</xml_diff>

<commit_message>
Move {name} to same line as לבין in contract.docx
Remove standalone {name} paragraph; append it as an underlined run
directly after the colon in the 'ל ב י ן:' paragraph so the renter's
name appears inline on that line.

Co-Authored-By: Claude Sonnet 4.6 <noreply@anthropic.com>
</commit_message>
<xml_diff>
--- a/contract.docx
+++ b/contract.docx
@@ -1191,22 +1191,6 @@
       </w:pPr>
       <w:r>
         <w:rPr>
-          <w:u w:val="single"/>
-          <w:rtl/>
-        </w:rPr>
-        <w:t xml:space="preserve">{name}</w:t>
-      </w:r>
-    </w:p>
-    <w:p>
-      <w:pPr>
-        <w:pStyle w:val="BodyText"/>
-        <w:bidi/>
-        <w:spacing w:before="8"/>
-        <w:ind w:right="4971" w:left="0" w:firstLine="0"/>
-        <w:jc w:val="left"/>
-      </w:pPr>
-      <w:r>
-        <w:rPr>
           <w:spacing w:val="-4"/>
           <w:w w:val="115"/>
           <w:rtl/>
@@ -1401,6 +1385,13 @@
           <w:w w:val="105"/>
         </w:rPr>
         <w:t>:</w:t>
+      </w:r>
+      <w:r>
+        <w:rPr>
+          <w:u w:val="single"/>
+          <w:rtl/>
+        </w:rPr>
+        <w:t xml:space="preserve"> {name}</w:t>
       </w:r>
     </w:p>
     <w:p>

</xml_diff>

<commit_message>
Fix {name} position: inline with לבין, right above מרח'
Add 'לבין: {name}' as a single line directly above the מרח' address line.
Remove {name} from the bottom ל ב י ן: paragraph.

Co-Authored-By: Claude Sonnet 4.6 <noreply@anthropic.com>
</commit_message>
<xml_diff>
--- a/contract.docx
+++ b/contract.docx
@@ -1191,6 +1191,29 @@
       </w:pPr>
       <w:r>
         <w:rPr>
+          <w:w w:val="115"/>
+          <w:rtl/>
+        </w:rPr>
+        <w:t xml:space="preserve">לבין: </w:t>
+      </w:r>
+      <w:r>
+        <w:rPr>
+          <w:u w:val="single"/>
+          <w:rtl/>
+        </w:rPr>
+        <w:t xml:space="preserve">{name}</w:t>
+      </w:r>
+    </w:p>
+    <w:p>
+      <w:pPr>
+        <w:pStyle w:val="BodyText"/>
+        <w:bidi/>
+        <w:spacing w:before="8"/>
+        <w:ind w:right="4971" w:left="0" w:firstLine="0"/>
+        <w:jc w:val="left"/>
+      </w:pPr>
+      <w:r>
+        <w:rPr>
           <w:spacing w:val="-4"/>
           <w:w w:val="115"/>
           <w:rtl/>
@@ -1385,13 +1408,6 @@
           <w:w w:val="105"/>
         </w:rPr>
         <w:t>:</w:t>
-      </w:r>
-      <w:r>
-        <w:rPr>
-          <w:u w:val="single"/>
-          <w:rtl/>
-        </w:rPr>
-        <w:t xml:space="preserve"> {name}</w:t>
       </w:r>
     </w:p>
     <w:p>

</xml_diff>

<commit_message>
Fix {name} wrapping into 4 lines: right-indent left almost no room in its column
The "לבין: {name}" and "מרח'" paragraphs sit in a 3-column section where that
column is 5376 twips wide, but both paragraphs had a right-indent of 4971
twips inherited from a different (wider) layout context — leaving only ~405
twips (0.28in) of usable line width. Any real name wrapped character-by-
character across multiple lines as a result.

Reduced the right-indent on both paragraphs from 4971 to 1248 (matching the
indent already used by the טלפון line directly below, for visual alignment),
giving ~2.9in of usable width — enough for any name on one line.

Co-Authored-By: Claude Opus 4.8 <noreply@anthropic.com>
</commit_message>
<xml_diff>
--- a/contract.docx
+++ b/contract.docx
@@ -1184,7 +1184,7 @@
         <w:pStyle w:val="BodyText"/>
         <w:bidi/>
         <w:spacing w:before="8"/>
-        <w:ind w:right="4971" w:left="0" w:firstLine="0"/>
+        <w:ind w:right="1248" w:left="0" w:firstLine="0"/>
         <w:jc w:val="left"/>
       </w:pPr>
       <w:r>
@@ -1207,7 +1207,7 @@
         <w:pStyle w:val="BodyText"/>
         <w:bidi/>
         <w:spacing w:before="8"/>
-        <w:ind w:right="4971" w:left="0" w:firstLine="0"/>
+        <w:ind w:right="1248" w:left="0" w:firstLine="0"/>
         <w:jc w:val="left"/>
       </w:pPr>
       <w:r>

</xml_diff>